<commit_message>
updates to cv etc.. for UFL application
</commit_message>
<xml_diff>
--- a/application_ufl/List of references.docx
+++ b/application_ufl/List of references.docx
@@ -9,59 +9,59 @@
           <w:rFonts w:ascii="Times New Roman" w:hAnsi="Times New Roman" w:cs="Times New Roman"/>
         </w:rPr>
       </w:pPr>
+      <w:r>
+        <w:rPr>
+          <w:rFonts w:ascii="Times New Roman" w:hAnsi="Times New Roman" w:cs="Times New Roman"/>
+        </w:rPr>
+        <w:t>List of references</w:t>
+      </w:r>
+    </w:p>
+    <w:p>
+      <w:pPr>
+        <w:rPr>
+          <w:rFonts w:ascii="Times New Roman" w:hAnsi="Times New Roman" w:cs="Times New Roman"/>
+          <w:sz w:val="24"/>
+          <w:szCs w:val="24"/>
+        </w:rPr>
+      </w:pPr>
+    </w:p>
+    <w:p>
+      <w:pPr>
+        <w:pStyle w:val="NoSpacing"/>
+        <w:rPr>
+          <w:rFonts w:ascii="Times New Roman" w:hAnsi="Times New Roman" w:cs="Times New Roman"/>
+          <w:sz w:val="24"/>
+          <w:szCs w:val="24"/>
+        </w:rPr>
+      </w:pPr>
+      <w:r>
+        <w:rPr>
+          <w:rFonts w:ascii="Times New Roman" w:hAnsi="Times New Roman" w:cs="Times New Roman"/>
+          <w:sz w:val="24"/>
+          <w:szCs w:val="24"/>
+        </w:rPr>
+        <w:t>Dr. Clarice R. Weinberg</w:t>
+      </w:r>
+    </w:p>
+    <w:p>
+      <w:pPr>
+        <w:pStyle w:val="NoSpacing"/>
+        <w:rPr>
+          <w:rFonts w:ascii="Times New Roman" w:hAnsi="Times New Roman" w:cs="Times New Roman"/>
+          <w:sz w:val="24"/>
+          <w:szCs w:val="24"/>
+        </w:rPr>
+      </w:pPr>
+      <w:r>
+        <w:rPr>
+          <w:rFonts w:ascii="Times New Roman" w:hAnsi="Times New Roman" w:cs="Times New Roman"/>
+          <w:sz w:val="24"/>
+          <w:szCs w:val="24"/>
+        </w:rPr>
+        <w:t>P.O. Box 12233</w:t>
+      </w:r>
       <w:bookmarkStart w:id="0" w:name="_GoBack"/>
       <w:bookmarkEnd w:id="0"/>
-      <w:r>
-        <w:rPr>
-          <w:rFonts w:ascii="Times New Roman" w:hAnsi="Times New Roman" w:cs="Times New Roman"/>
-        </w:rPr>
-        <w:t>List of references</w:t>
-      </w:r>
-    </w:p>
-    <w:p>
-      <w:pPr>
-        <w:rPr>
-          <w:rFonts w:ascii="Times New Roman" w:hAnsi="Times New Roman" w:cs="Times New Roman"/>
-          <w:sz w:val="24"/>
-          <w:szCs w:val="24"/>
-        </w:rPr>
-      </w:pPr>
-    </w:p>
-    <w:p>
-      <w:pPr>
-        <w:pStyle w:val="NoSpacing"/>
-        <w:rPr>
-          <w:rFonts w:ascii="Times New Roman" w:hAnsi="Times New Roman" w:cs="Times New Roman"/>
-          <w:sz w:val="24"/>
-          <w:szCs w:val="24"/>
-        </w:rPr>
-      </w:pPr>
-      <w:r>
-        <w:rPr>
-          <w:rFonts w:ascii="Times New Roman" w:hAnsi="Times New Roman" w:cs="Times New Roman"/>
-          <w:sz w:val="24"/>
-          <w:szCs w:val="24"/>
-        </w:rPr>
-        <w:t>Dr. Clarice R. Weinberg</w:t>
-      </w:r>
-    </w:p>
-    <w:p>
-      <w:pPr>
-        <w:pStyle w:val="NoSpacing"/>
-        <w:rPr>
-          <w:rFonts w:ascii="Times New Roman" w:hAnsi="Times New Roman" w:cs="Times New Roman"/>
-          <w:sz w:val="24"/>
-          <w:szCs w:val="24"/>
-        </w:rPr>
-      </w:pPr>
-      <w:r>
-        <w:rPr>
-          <w:rFonts w:ascii="Times New Roman" w:hAnsi="Times New Roman" w:cs="Times New Roman"/>
-          <w:sz w:val="24"/>
-          <w:szCs w:val="24"/>
-        </w:rPr>
-        <w:t>P.O. Box 12233</w:t>
-      </w:r>
     </w:p>
     <w:p>
       <w:pPr>
@@ -114,56 +114,14 @@
           <w:sz w:val="24"/>
           <w:szCs w:val="24"/>
         </w:rPr>
-        <w:t>T:</w:t>
-      </w:r>
-      <w:r>
-        <w:rPr>
-          <w:rFonts w:ascii="Times New Roman" w:hAnsi="Times New Roman" w:cs="Times New Roman"/>
-          <w:sz w:val="24"/>
-          <w:szCs w:val="24"/>
-        </w:rPr>
-        <w:t xml:space="preserve"> </w:t>
-      </w:r>
-      <w:r>
-        <w:rPr>
-          <w:rFonts w:ascii="Times New Roman" w:hAnsi="Times New Roman" w:cs="Times New Roman"/>
-          <w:sz w:val="24"/>
-          <w:szCs w:val="24"/>
-        </w:rPr>
-        <w:t>(</w:t>
-      </w:r>
-      <w:r>
-        <w:rPr>
-          <w:rFonts w:ascii="Times New Roman" w:hAnsi="Times New Roman" w:cs="Times New Roman"/>
-          <w:sz w:val="24"/>
-          <w:szCs w:val="24"/>
-        </w:rPr>
-        <w:t>984</w:t>
-      </w:r>
-      <w:r>
-        <w:rPr>
-          <w:rFonts w:ascii="Times New Roman" w:hAnsi="Times New Roman" w:cs="Times New Roman"/>
-          <w:sz w:val="24"/>
-          <w:szCs w:val="24"/>
-        </w:rPr>
-        <w:t xml:space="preserve">) </w:t>
-      </w:r>
-      <w:r>
-        <w:rPr>
-          <w:rFonts w:ascii="Times New Roman" w:hAnsi="Times New Roman" w:cs="Times New Roman"/>
-          <w:sz w:val="24"/>
-          <w:szCs w:val="24"/>
-        </w:rPr>
-        <w:t>287-3697</w:t>
-      </w:r>
-    </w:p>
-    <w:p>
-      <w:pPr>
-        <w:pStyle w:val="NoSpacing"/>
-        <w:rPr>
-          <w:rFonts w:ascii="Times New Roman" w:hAnsi="Times New Roman" w:cs="Times New Roman"/>
-          <w:sz w:val="24"/>
-          <w:szCs w:val="24"/>
+        <w:t>T: (984) 287-3697</w:t>
+      </w:r>
+    </w:p>
+    <w:p>
+      <w:pPr>
+        <w:pStyle w:val="NoSpacing"/>
+        <w:rPr>
+          <w:rStyle w:val="Hyperlink"/>
         </w:rPr>
       </w:pPr>
       <w:r>
@@ -176,9 +134,7 @@
       </w:r>
       <w:r>
         <w:rPr>
-          <w:rFonts w:ascii="Times New Roman" w:hAnsi="Times New Roman" w:cs="Times New Roman"/>
-          <w:sz w:val="24"/>
-          <w:szCs w:val="24"/>
+          <w:rStyle w:val="Hyperlink"/>
         </w:rPr>
         <w:t>weinberg@niehs.nih.gov</w:t>
       </w:r>
@@ -408,15 +364,7 @@
           <w:sz w:val="24"/>
           <w:szCs w:val="24"/>
         </w:rPr>
-        <w:t>C</w:t>
-      </w:r>
-      <w:r>
-        <w:rPr>
-          <w:rFonts w:ascii="Times New Roman" w:hAnsi="Times New Roman" w:cs="Times New Roman"/>
-          <w:sz w:val="24"/>
-          <w:szCs w:val="24"/>
-        </w:rPr>
-        <w:t>hapel Hill, NC 27599</w:t>
+        <w:t>Chapel Hill, NC 27599</w:t>
       </w:r>
     </w:p>
     <w:p>

</xml_diff>